<commit_message>
fix: added organization supervisor column, attendees list
</commit_message>
<xml_diff>
--- a/testdata/practice_protocol_template.docx
+++ b/testdata/practice_protocol_template.docx
@@ -8,8 +8,8 @@
         <w:jc w:val="center"/>
         <w:rPr>
           <w:rFonts w:ascii="Times New Roman" w:eastAsia="Times New Roman" w:hAnsi="Times New Roman" w:cs="Times New Roman"/>
-          <w:sz w:val="24"/>
-          <w:szCs w:val="24"/>
+          <w:sz w:val="26"/>
+          <w:szCs w:val="26"/>
           <w:lang w:eastAsia="ru-RU"/>
         </w:rPr>
       </w:pPr>
@@ -30,8 +30,8 @@
         <w:jc w:val="center"/>
         <w:rPr>
           <w:rFonts w:ascii="Times New Roman" w:eastAsia="Times New Roman" w:hAnsi="Times New Roman" w:cs="Times New Roman"/>
-          <w:sz w:val="24"/>
-          <w:szCs w:val="24"/>
+          <w:sz w:val="26"/>
+          <w:szCs w:val="26"/>
           <w:lang w:eastAsia="ru-RU"/>
         </w:rPr>
       </w:pPr>
@@ -54,8 +54,8 @@
         <w:jc w:val="right"/>
         <w:rPr>
           <w:rFonts w:ascii="Times New Roman" w:eastAsia="Times New Roman" w:hAnsi="Times New Roman" w:cs="Times New Roman"/>
-          <w:sz w:val="24"/>
-          <w:szCs w:val="24"/>
+          <w:sz w:val="26"/>
+          <w:szCs w:val="26"/>
           <w:lang w:eastAsia="ru-RU"/>
         </w:rPr>
       </w:pPr>
@@ -86,8 +86,8 @@
         <w:jc w:val="both"/>
         <w:rPr>
           <w:rFonts w:ascii="Times New Roman" w:eastAsia="Times New Roman" w:hAnsi="Times New Roman" w:cs="Times New Roman"/>
-          <w:sz w:val="24"/>
-          <w:szCs w:val="24"/>
+          <w:sz w:val="26"/>
+          <w:szCs w:val="26"/>
           <w:lang w:eastAsia="ru-RU"/>
         </w:rPr>
       </w:pPr>
@@ -108,8 +108,9 @@
         <w:jc w:val="both"/>
         <w:rPr>
           <w:rFonts w:ascii="Times New Roman" w:eastAsia="Times New Roman" w:hAnsi="Times New Roman" w:cs="Times New Roman"/>
-          <w:sz w:val="24"/>
-          <w:szCs w:val="24"/>
+          <w:color w:val="000000"/>
+          <w:sz w:val="26"/>
+          <w:szCs w:val="26"/>
           <w:lang w:eastAsia="ru-RU"/>
         </w:rPr>
       </w:pPr>
@@ -123,17 +124,6 @@
         </w:rPr>
         <w:t>СЕКРЕТАРЬ: {{SECRETARY}}</w:t>
       </w:r>
-    </w:p>
-    <w:p>
-      <w:pPr>
-        <w:spacing w:after="0" w:line="240" w:lineRule="auto"/>
-        <w:rPr>
-          <w:rFonts w:ascii="Times New Roman" w:eastAsia="Times New Roman" w:hAnsi="Times New Roman" w:cs="Times New Roman"/>
-          <w:sz w:val="24"/>
-          <w:szCs w:val="24"/>
-          <w:lang w:eastAsia="ru-RU"/>
-        </w:rPr>
-      </w:pPr>
     </w:p>
     <w:p>
       <w:pPr>
@@ -141,8 +131,61 @@
         <w:jc w:val="both"/>
         <w:rPr>
           <w:rFonts w:ascii="Times New Roman" w:eastAsia="Times New Roman" w:hAnsi="Times New Roman" w:cs="Times New Roman"/>
-          <w:sz w:val="24"/>
-          <w:szCs w:val="24"/>
+          <w:sz w:val="26"/>
+          <w:szCs w:val="26"/>
+          <w:lang w:eastAsia="ru-RU"/>
+        </w:rPr>
+      </w:pPr>
+      <w:r>
+        <w:rPr>
+          <w:rFonts w:ascii="Times New Roman" w:eastAsia="Times New Roman" w:hAnsi="Times New Roman" w:cs="Times New Roman"/>
+          <w:color w:val="000000"/>
+          <w:sz w:val="26"/>
+          <w:szCs w:val="26"/>
+          <w:lang w:eastAsia="ru-RU"/>
+        </w:rPr>
+        <w:t>ПРИСУТСТВОВАЛИ: {{</w:t>
+      </w:r>
+      <w:r>
+        <w:rPr>
+          <w:rFonts w:ascii="Times New Roman" w:eastAsia="Times New Roman" w:hAnsi="Times New Roman" w:cs="Times New Roman"/>
+          <w:color w:val="000000"/>
+          <w:sz w:val="26"/>
+          <w:szCs w:val="26"/>
+          <w:lang w:val="en-US" w:eastAsia="ru-RU"/>
+        </w:rPr>
+        <w:t>ATTENDEES</w:t>
+      </w:r>
+      <w:r>
+        <w:rPr>
+          <w:rFonts w:ascii="Times New Roman" w:eastAsia="Times New Roman" w:hAnsi="Times New Roman" w:cs="Times New Roman"/>
+          <w:color w:val="000000"/>
+          <w:sz w:val="26"/>
+          <w:szCs w:val="26"/>
+          <w:lang w:eastAsia="ru-RU"/>
+        </w:rPr>
+        <w:t>}}</w:t>
+      </w:r>
+    </w:p>
+    <w:p>
+      <w:pPr>
+        <w:spacing w:after="0" w:line="240" w:lineRule="auto"/>
+        <w:rPr>
+          <w:rFonts w:ascii="Times New Roman" w:eastAsia="Times New Roman" w:hAnsi="Times New Roman" w:cs="Times New Roman"/>
+          <w:sz w:val="26"/>
+          <w:szCs w:val="26"/>
+          <w:lang w:eastAsia="ru-RU"/>
+        </w:rPr>
+      </w:pPr>
+    </w:p>
+    <w:p>
+      <w:pPr>
+        <w:spacing w:after="0" w:line="240" w:lineRule="auto"/>
+        <w:jc w:val="both"/>
+        <w:rPr>
+          <w:rFonts w:ascii="Times New Roman" w:eastAsia="Times New Roman" w:hAnsi="Times New Roman" w:cs="Times New Roman"/>
+          <w:sz w:val="26"/>
+          <w:szCs w:val="26"/>
           <w:lang w:eastAsia="ru-RU"/>
         </w:rPr>
       </w:pPr>
@@ -167,9 +210,39 @@
           <w:color w:val="000000"/>
           <w:sz w:val="26"/>
           <w:szCs w:val="26"/>
+          <w:lang w:eastAsia="ru-RU"/>
+        </w:rPr>
+      </w:pPr>
+      <w:r>
+        <w:rPr>
+          <w:rFonts w:ascii="Times New Roman" w:eastAsia="Times New Roman" w:hAnsi="Times New Roman" w:cs="Times New Roman"/>
+          <w:color w:val="000000"/>
+          <w:sz w:val="26"/>
+          <w:szCs w:val="26"/>
+          <w:lang w:eastAsia="ru-RU"/>
+        </w:rPr>
+        <w:t>{{</w:t>
+      </w:r>
+      <w:r>
+        <w:rPr>
+          <w:rFonts w:ascii="Times New Roman" w:eastAsia="Times New Roman" w:hAnsi="Times New Roman" w:cs="Times New Roman"/>
+          <w:color w:val="000000"/>
+          <w:sz w:val="26"/>
+          <w:szCs w:val="26"/>
           <w:lang w:val="en-US" w:eastAsia="ru-RU"/>
         </w:rPr>
-      </w:pPr>
+        <w:t>AGENDA</w:t>
+      </w:r>
+      <w:r>
+        <w:rPr>
+          <w:rFonts w:ascii="Times New Roman" w:eastAsia="Times New Roman" w:hAnsi="Times New Roman" w:cs="Times New Roman"/>
+          <w:color w:val="000000"/>
+          <w:sz w:val="26"/>
+          <w:szCs w:val="26"/>
+          <w:lang w:eastAsia="ru-RU"/>
+        </w:rPr>
+        <w:t>_</w:t>
+      </w:r>
       <w:r>
         <w:rPr>
           <w:rFonts w:ascii="Times New Roman" w:eastAsia="Times New Roman" w:hAnsi="Times New Roman" w:cs="Times New Roman"/>
@@ -178,16 +251,6 @@
           <w:szCs w:val="26"/>
           <w:lang w:val="en-US" w:eastAsia="ru-RU"/>
         </w:rPr>
-        <w:t>{{AGENDA_</w:t>
-      </w:r>
-      <w:r>
-        <w:rPr>
-          <w:rFonts w:ascii="Times New Roman" w:eastAsia="Times New Roman" w:hAnsi="Times New Roman" w:cs="Times New Roman"/>
-          <w:color w:val="000000"/>
-          <w:sz w:val="26"/>
-          <w:szCs w:val="26"/>
-          <w:lang w:val="en-US" w:eastAsia="ru-RU"/>
-        </w:rPr>
         <w:t>ITEMS</w:t>
       </w:r>
       <w:r>
@@ -196,7 +259,7 @@
           <w:color w:val="000000"/>
           <w:sz w:val="26"/>
           <w:szCs w:val="26"/>
-          <w:lang w:val="en-US" w:eastAsia="ru-RU"/>
+          <w:lang w:eastAsia="ru-RU"/>
         </w:rPr>
         <w:t>}}</w:t>
       </w:r>
@@ -206,9 +269,9 @@
         <w:spacing w:after="0" w:line="240" w:lineRule="auto"/>
         <w:rPr>
           <w:rFonts w:ascii="Times New Roman" w:eastAsia="Times New Roman" w:hAnsi="Times New Roman" w:cs="Times New Roman"/>
-          <w:sz w:val="24"/>
-          <w:szCs w:val="24"/>
-          <w:lang w:val="en-US" w:eastAsia="ru-RU"/>
+          <w:sz w:val="26"/>
+          <w:szCs w:val="26"/>
+          <w:lang w:eastAsia="ru-RU"/>
         </w:rPr>
       </w:pPr>
     </w:p>
@@ -218,30 +281,20 @@
         <w:jc w:val="both"/>
         <w:rPr>
           <w:rFonts w:ascii="Times New Roman" w:eastAsia="Times New Roman" w:hAnsi="Times New Roman" w:cs="Times New Roman"/>
-          <w:sz w:val="24"/>
-          <w:szCs w:val="24"/>
-          <w:lang w:val="en-US" w:eastAsia="ru-RU"/>
-        </w:rPr>
-      </w:pPr>
-      <w:r>
-        <w:rPr>
-          <w:rFonts w:ascii="Times New Roman" w:eastAsia="Times New Roman" w:hAnsi="Times New Roman" w:cs="Times New Roman"/>
-          <w:color w:val="000000"/>
-          <w:sz w:val="26"/>
-          <w:szCs w:val="26"/>
-          <w:lang w:eastAsia="ru-RU"/>
-        </w:rPr>
-        <w:t>РАССМАТРИВАЛИ</w:t>
-      </w:r>
-      <w:r>
-        <w:rPr>
-          <w:rFonts w:ascii="Times New Roman" w:eastAsia="Times New Roman" w:hAnsi="Times New Roman" w:cs="Times New Roman"/>
-          <w:color w:val="000000"/>
-          <w:sz w:val="26"/>
-          <w:szCs w:val="26"/>
-          <w:lang w:val="en-US" w:eastAsia="ru-RU"/>
-        </w:rPr>
-        <w:t>:</w:t>
+          <w:sz w:val="26"/>
+          <w:szCs w:val="26"/>
+          <w:lang w:eastAsia="ru-RU"/>
+        </w:rPr>
+      </w:pPr>
+      <w:r>
+        <w:rPr>
+          <w:rFonts w:ascii="Times New Roman" w:eastAsia="Times New Roman" w:hAnsi="Times New Roman" w:cs="Times New Roman"/>
+          <w:color w:val="000000"/>
+          <w:sz w:val="26"/>
+          <w:szCs w:val="26"/>
+          <w:lang w:eastAsia="ru-RU"/>
+        </w:rPr>
+        <w:t>РАССМАТРИВАЛИ:</w:t>
       </w:r>
     </w:p>
     <w:p>
@@ -254,9 +307,39 @@
           <w:color w:val="000000"/>
           <w:sz w:val="26"/>
           <w:szCs w:val="26"/>
+          <w:lang w:eastAsia="ru-RU"/>
+        </w:rPr>
+      </w:pPr>
+      <w:r>
+        <w:rPr>
+          <w:rFonts w:ascii="Times New Roman" w:eastAsia="Times New Roman" w:hAnsi="Times New Roman" w:cs="Times New Roman"/>
+          <w:color w:val="000000"/>
+          <w:sz w:val="26"/>
+          <w:szCs w:val="26"/>
+          <w:lang w:eastAsia="ru-RU"/>
+        </w:rPr>
+        <w:t>{{</w:t>
+      </w:r>
+      <w:r>
+        <w:rPr>
+          <w:rFonts w:ascii="Times New Roman" w:eastAsia="Times New Roman" w:hAnsi="Times New Roman" w:cs="Times New Roman"/>
+          <w:color w:val="000000"/>
+          <w:sz w:val="26"/>
+          <w:szCs w:val="26"/>
           <w:lang w:val="en-US" w:eastAsia="ru-RU"/>
         </w:rPr>
-      </w:pPr>
+        <w:t>CONSIDERED</w:t>
+      </w:r>
+      <w:r>
+        <w:rPr>
+          <w:rFonts w:ascii="Times New Roman" w:eastAsia="Times New Roman" w:hAnsi="Times New Roman" w:cs="Times New Roman"/>
+          <w:color w:val="000000"/>
+          <w:sz w:val="26"/>
+          <w:szCs w:val="26"/>
+          <w:lang w:eastAsia="ru-RU"/>
+        </w:rPr>
+        <w:t>_</w:t>
+      </w:r>
       <w:r>
         <w:rPr>
           <w:rFonts w:ascii="Times New Roman" w:eastAsia="Times New Roman" w:hAnsi="Times New Roman" w:cs="Times New Roman"/>
@@ -265,16 +348,6 @@
           <w:szCs w:val="26"/>
           <w:lang w:val="en-US" w:eastAsia="ru-RU"/>
         </w:rPr>
-        <w:t>{{CONSIDERED_</w:t>
-      </w:r>
-      <w:r>
-        <w:rPr>
-          <w:rFonts w:ascii="Times New Roman" w:eastAsia="Times New Roman" w:hAnsi="Times New Roman" w:cs="Times New Roman"/>
-          <w:color w:val="000000"/>
-          <w:sz w:val="26"/>
-          <w:szCs w:val="26"/>
-          <w:lang w:val="en-US" w:eastAsia="ru-RU"/>
-        </w:rPr>
         <w:t>ITEMS</w:t>
       </w:r>
       <w:r>
@@ -283,7 +356,7 @@
           <w:color w:val="000000"/>
           <w:sz w:val="26"/>
           <w:szCs w:val="26"/>
-          <w:lang w:val="en-US" w:eastAsia="ru-RU"/>
+          <w:lang w:eastAsia="ru-RU"/>
         </w:rPr>
         <w:t>}}</w:t>
       </w:r>
@@ -293,9 +366,9 @@
         <w:spacing w:after="0" w:line="240" w:lineRule="auto"/>
         <w:rPr>
           <w:rFonts w:ascii="Times New Roman" w:eastAsia="Times New Roman" w:hAnsi="Times New Roman" w:cs="Times New Roman"/>
-          <w:sz w:val="24"/>
-          <w:szCs w:val="24"/>
-          <w:lang w:val="en-US" w:eastAsia="ru-RU"/>
+          <w:sz w:val="26"/>
+          <w:szCs w:val="26"/>
+          <w:lang w:eastAsia="ru-RU"/>
         </w:rPr>
       </w:pPr>
     </w:p>
@@ -305,50 +378,30 @@
         <w:jc w:val="both"/>
         <w:rPr>
           <w:rFonts w:ascii="Times New Roman" w:eastAsia="Times New Roman" w:hAnsi="Times New Roman" w:cs="Times New Roman"/>
-          <w:sz w:val="24"/>
-          <w:szCs w:val="24"/>
+          <w:sz w:val="26"/>
+          <w:szCs w:val="26"/>
+          <w:lang w:eastAsia="ru-RU"/>
+        </w:rPr>
+      </w:pPr>
+      <w:r>
+        <w:rPr>
+          <w:rFonts w:ascii="Times New Roman" w:eastAsia="Times New Roman" w:hAnsi="Times New Roman" w:cs="Times New Roman"/>
+          <w:color w:val="000000"/>
+          <w:sz w:val="26"/>
+          <w:szCs w:val="26"/>
+          <w:lang w:eastAsia="ru-RU"/>
+        </w:rPr>
+        <w:t>ПОСТАНОВИЛИ (единогласно):</w:t>
+      </w:r>
+      <w:r>
+        <w:rPr>
+          <w:rFonts w:ascii="Times New Roman" w:eastAsia="Times New Roman" w:hAnsi="Times New Roman" w:cs="Times New Roman"/>
+          <w:color w:val="000000"/>
+          <w:sz w:val="26"/>
+          <w:szCs w:val="26"/>
           <w:lang w:val="en-US" w:eastAsia="ru-RU"/>
         </w:rPr>
-      </w:pPr>
-      <w:r>
-        <w:rPr>
-          <w:rFonts w:ascii="Times New Roman" w:eastAsia="Times New Roman" w:hAnsi="Times New Roman" w:cs="Times New Roman"/>
-          <w:color w:val="000000"/>
-          <w:sz w:val="26"/>
-          <w:szCs w:val="26"/>
-          <w:lang w:eastAsia="ru-RU"/>
-        </w:rPr>
-        <w:t>ПОСТАНОВИЛИ</w:t>
-      </w:r>
-      <w:r>
-        <w:rPr>
-          <w:rFonts w:ascii="Times New Roman" w:eastAsia="Times New Roman" w:hAnsi="Times New Roman" w:cs="Times New Roman"/>
-          <w:color w:val="000000"/>
-          <w:sz w:val="26"/>
-          <w:szCs w:val="26"/>
-          <w:lang w:val="en-US" w:eastAsia="ru-RU"/>
-        </w:rPr>
-        <w:t xml:space="preserve"> (</w:t>
-      </w:r>
-      <w:r>
-        <w:rPr>
-          <w:rFonts w:ascii="Times New Roman" w:eastAsia="Times New Roman" w:hAnsi="Times New Roman" w:cs="Times New Roman"/>
-          <w:color w:val="000000"/>
-          <w:sz w:val="26"/>
-          <w:szCs w:val="26"/>
-          <w:lang w:eastAsia="ru-RU"/>
-        </w:rPr>
-        <w:t>единогласно</w:t>
-      </w:r>
-      <w:r>
-        <w:rPr>
-          <w:rFonts w:ascii="Times New Roman" w:eastAsia="Times New Roman" w:hAnsi="Times New Roman" w:cs="Times New Roman"/>
-          <w:color w:val="000000"/>
-          <w:sz w:val="26"/>
-          <w:szCs w:val="26"/>
-          <w:lang w:val="en-US" w:eastAsia="ru-RU"/>
-        </w:rPr>
-        <w:t>): </w:t>
+        <w:t> </w:t>
       </w:r>
     </w:p>
     <w:p>
@@ -361,9 +414,39 @@
           <w:color w:val="000000"/>
           <w:sz w:val="26"/>
           <w:szCs w:val="26"/>
+          <w:lang w:eastAsia="ru-RU"/>
+        </w:rPr>
+      </w:pPr>
+      <w:r>
+        <w:rPr>
+          <w:rFonts w:ascii="Times New Roman" w:eastAsia="Times New Roman" w:hAnsi="Times New Roman" w:cs="Times New Roman"/>
+          <w:color w:val="000000"/>
+          <w:sz w:val="26"/>
+          <w:szCs w:val="26"/>
+          <w:lang w:eastAsia="ru-RU"/>
+        </w:rPr>
+        <w:t>{{</w:t>
+      </w:r>
+      <w:r>
+        <w:rPr>
+          <w:rFonts w:ascii="Times New Roman" w:eastAsia="Times New Roman" w:hAnsi="Times New Roman" w:cs="Times New Roman"/>
+          <w:color w:val="000000"/>
+          <w:sz w:val="26"/>
+          <w:szCs w:val="26"/>
           <w:lang w:val="en-US" w:eastAsia="ru-RU"/>
         </w:rPr>
-      </w:pPr>
+        <w:t>DECISION</w:t>
+      </w:r>
+      <w:r>
+        <w:rPr>
+          <w:rFonts w:ascii="Times New Roman" w:eastAsia="Times New Roman" w:hAnsi="Times New Roman" w:cs="Times New Roman"/>
+          <w:color w:val="000000"/>
+          <w:sz w:val="26"/>
+          <w:szCs w:val="26"/>
+          <w:lang w:eastAsia="ru-RU"/>
+        </w:rPr>
+        <w:t>_</w:t>
+      </w:r>
       <w:r>
         <w:rPr>
           <w:rFonts w:ascii="Times New Roman" w:eastAsia="Times New Roman" w:hAnsi="Times New Roman" w:cs="Times New Roman"/>
@@ -372,7 +455,17 @@
           <w:szCs w:val="26"/>
           <w:lang w:val="en-US" w:eastAsia="ru-RU"/>
         </w:rPr>
-        <w:t>{{DECISION_TEXT}}</w:t>
+        <w:t>TEXT</w:t>
+      </w:r>
+      <w:r>
+        <w:rPr>
+          <w:rFonts w:ascii="Times New Roman" w:eastAsia="Times New Roman" w:hAnsi="Times New Roman" w:cs="Times New Roman"/>
+          <w:color w:val="000000"/>
+          <w:sz w:val="26"/>
+          <w:szCs w:val="26"/>
+          <w:lang w:eastAsia="ru-RU"/>
+        </w:rPr>
+        <w:t>}}</w:t>
       </w:r>
     </w:p>
     <w:p>

</xml_diff>